<commit_message>
v13: apply the independent re-check (thread note restored, four wording fixes)
- Table III: restore v12's "XGBoost was run single-threaded" note; c2.make_model defaults
  XGBoost to n_jobs=1, so the first v13 build's "all available cores" was wrong. The audit
  now compares one thread with an explicit n_jobs=-1 fit (identical predictions).
- VI-D: XGBoost-only draw SDs (0.012, 0.024); IV-D BROWSING/P2P wording matches XI;
  VI-F sentence reworded; row-block accuracy stated comparatively; III-C k-means settings.
- Ledger updated; the separate session's verification report saved with it.
</commit_message>
<xml_diff>
--- a/paper/SHAP_VPN_revised_v13.docx
+++ b/paper/SHAP_VPN_revised_v13.docx
@@ -5100,7 +5100,7 @@
       </w:pPr>
       <w:r>
         <w:rPr/>
-        <w:t>Test records are as close to the training data as training records are to each other. That is what a random split of correlated flows produces, so the audit rules out gross copying but not dependence between related flows. As a proxy for session grouping we clustered the log-transformed training flows of each context into 50 k-means clusters and compared five-fold cross-validation that keeps clusters intact with ordinary stratified five-fold cross-validation. On Non-VPN, macro F1 falls from 0.924 to 0.642 for XGBoost and from 0.901 to 0.475 for Random Forest; on VPN, from 0.880 to 0.551 and from 0.862 to 0.493. Holding out whole clusters also asks a model to extrapolate to unseen regions of feature space, so this drop overstates what session grouping alone would cost, but performance clearly depends on having similar flows on both sides of a split.</w:t>
+        <w:t xml:space="preserve">Test records are as close to the training data as training records are to each other. That is what a random split of correlated flows produces, so the audit rules out gross copying but not dependence between related flows. As a proxy for session grouping we clustered the log-transformed training flows of each context into 50 k-means clusters (three initialisations, fixed seed) and compared five-fold cross-validation that keeps clusters intact with ordinary stratified five-fold cross-validation. On Non-VPN, macro F1 falls from 0.924 to 0.642 for XGBoost and from 0.901 to 0.475 for Random Forest; on VPN, from 0.880 to 0.551 and from 0.862 to 0.493. Holding out whole clusters also asks a model to extrapolate to unseen regions of feature space, so this drop overstates what session grouping alone would cost, but performance clearly depends on having similar flows on both sides of a split.</w:t>
       </w:r>
     </w:p>
     <w:p>
@@ -5643,7 +5643,7 @@
           <w:sz w:val="17"/>
           <w:szCs w:val="17"/>
         </w:rPr>
-        <w:t xml:space="preserve">The same hyperparameters are used in both contexts, and all models take the original features. Every result was computed under Python 3.13.16, NumPy 2.5.3, pandas 3.0.5, scikit-learn 1.9.1, XGBoost 3.4.1 and SHAP 0.53.0 on Linux (x86-64). XGBoost used one thread in the repeated designs and all available cores in the other fits; refitting the primary models with one thread and with two gave identical predictions.</w:t>
+        <w:t>The same hyperparameters are used in both contexts, and all models take the original features. Every result was computed under Python 3.13.16, NumPy 2.5.3, pandas 3.0.5, scikit-learn 1.9.1, XGBoost 3.4.1 and SHAP 0.53.0 on Linux (x86-64). XGBoost was run single-threaded; refitting with two threads gave identical predictions.</w:t>
       </w:r>
     </w:p>
     <w:p>
@@ -7497,7 +7497,7 @@
       </ns0:oMath>
       <w:r>
         <w:rPr/>
-        <w:t xml:space="preserve">| up to 0.68). The files therefore seem to keep many flows of one capture close together, but the evidence is weak for those four VPN classes, and the dataset documentation does not describe the row order. We form halves from contiguous blocks of rows within each class: blocks of about 10, 35 or 140 training flows, as many blocks as the class has capture files (calibrated, as above), and, as the strictest setting, the first versus the second half of each class. Blocks are assigned to halves in the same way as clusters. The resulting halves hold 3,264–3,476 training flows (3,264 with blocks of about 140 flows), against 3,476–3,477 for random halves. This grouping has its own weaknesses. Equal-sized blocks do not follow capture boundaries, so a capture can straddle two blocks and reach both halves, and the first-versus-second-half split may also separate different applications within a class. BROWSING and P2P, which hold 34–40% of the training flows, cannot be divided by capture at all: BROWSING has no capture files of its own in the prefix list, so its flows cannot be traced to captures, and P2P has at most one listed capture per context. The row-order blocks are a proxy for related flows, not a capture split, and they do not establish session independence.</w:t>
+        <w:t xml:space="preserve">| up to 0.68). The files therefore seem to keep many flows of one capture close together, but the evidence is weak for those four VPN classes, and the dataset documentation does not describe the row order. We form halves from contiguous blocks of rows within each class: blocks of about 10, 35 or 140 training flows, as many blocks as the class has capture files (calibrated, as above), and, as the strictest setting, the first versus the second half of each class. Blocks are assigned to halves in the same way as clusters. The resulting halves hold 3,264–3,476 training flows (3,264 with blocks of about 140 flows), against 3,476–3,477 for random halves. This grouping has its own weaknesses. Equal-sized blocks do not follow capture boundaries, so a capture can straddle two blocks and reach both halves, and the first-versus-second-half split may also separate different applications within a class. BROWSING and P2P, which hold 34–40% of the training flows, cannot be divided by capture with the information available: BROWSING has no capture files of its own in the prefix list, so its flows cannot be traced to captures, and P2P has at most one listed capture per context. The row-order blocks are a proxy for related flows, not a capture split, and they do not establish session independence.</w:t>
       </w:r>
     </w:p>
     <w:p>
@@ -12886,7 +12886,7 @@
       </w:pPr>
       <w:r>
         <w:rPr/>
-        <w:t xml:space="preserve">Blocks of consecutive rows in the original files yield a different picture (Section IV-D). They reduce within-context agreement considerably less than clusters do, and the half-models remain accurate (macro F1 0.73–0.90). With blocks of approximately 10, 35 and 140 training flows, </w:t>
+        <w:t xml:space="preserve">Blocks of consecutive rows in the original files yield a different picture (Section IV-D). They reduce within-context agreement considerably less than clusters do, and the half-models remain far more accurate than under coarse clusters (macro F1 0.73–0.90). With blocks of approximately 10, 35 and 140 training flows, </w:t>
       </w:r>
       <w:r>
         <w:rPr/>
@@ -18967,7 +18967,7 @@
       </m:oMath>
       <w:r>
         <w:rPr/>
-        <w:t xml:space="preserve"> = 0.936–0.986). The swap does not bring a context materially closer to the other one. Agreement with the other context's primary ranking changes by +0.008, +0.017, -0.035, -0.007 for XGBoost (Non-VPN, VPN) and Random Forest (Non-VPN, VPN), against a cross-context gap of 0.13–0.19 under random halves. The two XGBoost changes are small moves toward the other context, no larger than the spread across draws (SD 0.009–0.024). The permutation null of Section VI-C, which keeps both class mixes and removes everything else, gives no XGBoost gap and a Random Forest gap of 0.03. Class-weighted importance leaves the gaps in place (Table VII).</w:t>
+        <w:t xml:space="preserve"> = 0.936–0.986). The swap does not bring a context materially closer to the other one. Agreement with the other context's primary ranking changes by +0.008, +0.017, -0.035, -0.007 for XGBoost (Non-VPN, VPN) and Random Forest (Non-VPN, VPN), against a cross-context gap of 0.13–0.19 under random halves. The two XGBoost changes are small moves toward the other context, smaller than the spread of the natural-mix models across draws (SD 0.012 and 0.024). The permutation null of Section VI-C, which keeps both class mixes and removes everything else, gives no XGBoost gap and a Random Forest gap of 0.03. Class-weighted importance leaves the gaps in place (Table VII).</w:t>
       </w:r>
     </w:p>
     <w:p>
@@ -22470,7 +22470,7 @@
       </w:pPr>
       <w:r>
         <w:rPr/>
-        <w:t xml:space="preserve">Under flow-level random halves, VPN rankings agree with each other more closely than Non-VPN rankings do (XGBoost 0.964 against 0.943; Random Forest 0.976 against 0.928), even though VPN accuracy is lower. This trend inverts under cluster grouping. With clusters of approximately 140 flows, within-VPN agreement falls below within-Non-VPN agreement for both models (0.740 against 0.804, and 0.431 against 0.612), and Random Forest reverses the trend at about ten flows per cluster. With blocks of consecutive rows, within-VPN rankings are again the steadier ones (calibrated blocks: 0.942 against 0.919 for XGBoost, 0.906 against 0.884 for Random Forest). Row blocks are, however, the weaker proxy in four VPN classes: adjacent rows of VPN FT, MAIL, P2P and VOIP are nearly as different as random rows (Section IV-D), so the blocks may keep fewer related VPN flows together than intended. Which context gives the steadier rankings therefore depends on the grouping, and neither proxy settles it. The capture counts of Section IV-D indicate the same direction: A VPN capture contributes several-fold more flows than a Non-VPN capture, hence random halves of VPN data share more related flows. Part of the apparent steadiness of the VPN explanations may therefore stem from redundancy among related VPN flows rather than from any stability of the VPN explanation itself. Class balance may also play a role as the rarest VPN class has 4.6% of training flows against 2.7% for Non-VPN MAIL, and rare classes give noisier attributions.</w:t>
+        <w:t xml:space="preserve">Under flow-level random halves, VPN rankings agree with each other more closely than Non-VPN rankings do (XGBoost 0.964 against 0.943; Random Forest 0.976 against 0.928), even though VPN accuracy is lower. This trend inverts under cluster grouping. With clusters of approximately 140 flows, within-VPN agreement falls below within-Non-VPN agreement for both models (0.740 against 0.804, and 0.431 against 0.612), and Random Forest reverses the trend at about ten flows per cluster. With blocks of consecutive rows, within-VPN rankings are again the steadier ones (calibrated blocks: 0.942 against 0.919 for XGBoost, 0.906 against 0.884 for Random Forest). Row blocks are, however, the weaker proxy in four VPN classes: adjacent rows of VPN FT, MAIL, P2P and VOIP are nearly as different as random rows (Section IV-D), so the blocks may keep fewer related VPN flows together than intended. Which context gives the steadier rankings therefore depends on the grouping, and neither proxy settles it. The capture counts of Section IV-D suggest one reason for the steadier VPN rankings under random halves: a VPN capture contributes several-fold more flows than a Non-VPN capture, hence random halves of VPN data share more related flows. Part of the apparent steadiness of the VPN explanations may therefore stem from redundancy among related VPN flows rather than from any stability of the VPN explanation itself. Class balance may also play a role as the rarest VPN class has 4.6% of training flows against 2.7% for Non-VPN MAIL, and rare classes give noisier attributions.</w:t>
       </w:r>
     </w:p>
     <w:p>
@@ -32817,7 +32817,7 @@
       </w:r>
       <w:r>
         <w:rPr/>
-        <w:t xml:space="preserve">The answer to the question posed in the title depends on what cross-context agreement is compared with. Against models trained on random halves of one context, VPN and Non-VPN rankings disagree more, in every repeat, and the permutation null shows that neither the half-split procedure nor the class-mix difference produces such a gap. Keeping related flows together reduces the gap, but by how much depends on the proxy for related flows. Feature clusters eliminate most of it; at the settings that the capture counts point to the mean gap is near zero, but the half-models are weak, the gap varies widely, and for Random Forest the mean averages a gap of +0.23 on the Non-VPN side and -0.19 on the VPN side, and clusters also separate regions of feature space that a capture split would not. Blocks of consecutive rows in the original files are not built from the features, although row position is correlated with some of them, and they leave the half-models accurate. At the capture-calibrated setting they reduce the gap to 0.07 for XGBoost and 0.15 for Random Forest, and even the first-versus-second-half split leaves 0.03 and 0.09 on average. The Spearman gap stays at or above zero in every repeat, but the repeats reuse nearly the same halves, and the RBO and Top-5 gaps turn negative in some of them. The two proxies disagree, and neither is a capture split: clusters may overcorrect, and blocks may undercorrect or, at their strictest, also separate regions of feature space. Together they suggest that part of the random-split gap reflects variation between groups of related flows, from about 20% to nearly all of it depending on the proxy and model, and that some excess probably remains. That excess is described, not tested: the permutation null covers only random halves, the outer split is random in every design, and within-context and cross-context pairs are explained on different kinds of test records. Without capture identifiers or an independent second capture, the size of that excess cannot be quantified, and because the contexts are different sets of captures it cannot be attributed to tunnelling. A random within-context split, which is the usual way such references are built, would have exaggerated it.</w:t>
+        <w:t xml:space="preserve">The answer to the question posed in the title depends on what cross-context agreement is compared with. Against models trained on random halves of one context, VPN and Non-VPN rankings disagree more, in every repeat, and the permutation null shows that neither the half-split procedure nor the class-mix difference produces such a gap. Keeping related flows together reduces the gap, but by how much depends on the proxy for related flows. Feature clusters eliminate most of it; at the settings that the capture counts point to the mean gap is near zero, but the half-models are weak, the gap varies widely, and for Random Forest the mean averages a gap of +0.23 on the Non-VPN side and -0.19 on the VPN side, and clusters also separate regions of feature space that a capture split would not. Blocks of consecutive rows in the original files are not built from the features, although row position is correlated with some of them, and they leave the half-models far more accurate than coarse clusters do. At the capture-calibrated setting they reduce the gap to 0.07 for XGBoost and 0.15 for Random Forest, and even the first-versus-second-half split leaves 0.03 and 0.09 on average. The Spearman gap stays at or above zero in every repeat, but the repeats reuse nearly the same halves, and the RBO and Top-5 gaps turn negative in some of them. The two proxies disagree, and neither is a capture split: clusters may overcorrect, and blocks may undercorrect or, at their strictest, also separate regions of feature space. Together they suggest that part of the random-split gap reflects variation between groups of related flows, from about 20% to nearly all of it depending on the proxy and model, and that some excess probably remains. That excess is described, not tested: the permutation null covers only random halves, the outer split is random in every design, and within-context and cross-context pairs are explained on different kinds of test records. Without capture identifiers or an independent second capture, the size of that excess cannot be quantified, and because the contexts are different sets of captures it cannot be attributed to tunnelling. A random within-context split, which is the usual way such references are built, would have exaggerated it.</w:t>
       </w:r>
     </w:p>
     <w:p>

</xml_diff>